<commit_message>
Update the IBS user manual to version 1.5
Rebuilt from ibs-business-management-system main (d495ecc): Stock In now
opens a purchase (9.1), Add Product takes several opening batches, and
the other pages pick up the new search index.
</commit_message>
<xml_diff>
--- a/help/ibs/IBS_User_Manual.docx
+++ b/help/ibs/IBS_User_Manual.docx
@@ -3430,7 +3430,7 @@
             <w:rStyle w:val="Hyperlink"/>
             <w:noProof/>
           </w:rPr>
-          <w:t>9.1 Stock In (receiving stock outside of a full purchase)</w:t>
+          <w:t>9.1 Stock In</w:t>
         </w:r>
         <w:r>
           <w:rPr>
@@ -11312,7 +11312,7 @@
         </w:numPr>
       </w:pPr>
       <w:r>
-        <w:t>If batch tracking is on and this product expires, tick “Track batches and expiry dates.” With opening stock, also enter its Opening stock batch no. (optional) and Opening stock expiry date (required).</w:t>
+        <w:t>If batch tracking is on and this product expires, tick “Track batches and expiry dates.” With opening stock, also enter its batch no. (optional) and expiry date (required).</w:t>
       </w:r>
     </w:p>
     <w:p>
@@ -11360,7 +11360,7 @@
               <w:t xml:space="preserve">Note:  </w:t>
             </w:r>
             <w:r>
-              <w:t>Opening stock from more than one batch? Enter one batch when creating the product, then add the rest with Stock In (section 9.1).</w:t>
+              <w:t>Opening stock from more than one batch? Click “+ Another batch” and enter each batch’s number, expiry date and quantity. Together the batches must add up to the Initial Stock Quantity.</w:t>
             </w:r>
           </w:p>
         </w:tc>
@@ -11806,7 +11806,7 @@
         <w:rPr>
           <w:color w:val="1D4E89"/>
         </w:rPr>
-        <w:t>9.1 Stock In (receiving stock outside of a full purchase)</w:t>
+        <w:t>9.1 Stock In</w:t>
       </w:r>
       <w:bookmarkEnd w:id="45"/>
     </w:p>
@@ -11820,7 +11820,7 @@
         </w:numPr>
       </w:pPr>
       <w:r>
-        <w:t>Click “↑ Stock In.”</w:t>
+        <w:t>Click “↑ Stock In,” or the + button on a product’s row.</w:t>
       </w:r>
     </w:p>
     <w:p>
@@ -11833,7 +11833,7 @@
         </w:numPr>
       </w:pPr>
       <w:r>
-        <w:t>Search and select the Product.</w:t>
+        <w:t>Create Purchase opens (section 5.2). If you started from a product’s row, that product is already in the cart.</w:t>
       </w:r>
     </w:p>
     <w:p>
@@ -11846,46 +11846,7 @@
         </w:numPr>
       </w:pPr>
       <w:r>
-        <w:t>Enter the Quantity received.</w:t>
-      </w:r>
-    </w:p>
-    <w:p>
-      <w:pPr>
-        <w:pStyle w:val="ListNumber"/>
-        <w:keepNext/>
-        <w:numPr>
-          <w:ilvl w:val="0"/>
-          <w:numId w:val="16"/>
-        </w:numPr>
-      </w:pPr>
-      <w:r>
-        <w:t>For a product tracked by batch, enter the Batch No. (optional) and Expiry Date (required).</w:t>
-      </w:r>
-    </w:p>
-    <w:p>
-      <w:pPr>
-        <w:pStyle w:val="ListNumber"/>
-        <w:keepNext/>
-        <w:numPr>
-          <w:ilvl w:val="0"/>
-          <w:numId w:val="16"/>
-        </w:numPr>
-      </w:pPr>
-      <w:r>
-        <w:t>Optionally set a new Cost Price (leave blank to keep the existing cost).</w:t>
-      </w:r>
-    </w:p>
-    <w:p>
-      <w:pPr>
-        <w:pStyle w:val="ListNumber"/>
-        <w:keepNext/>
-        <w:numPr>
-          <w:ilvl w:val="0"/>
-          <w:numId w:val="16"/>
-        </w:numPr>
-      </w:pPr>
-      <w:r>
-        <w:t>Optionally enter a Reference (invoice/delivery note number), and choose the Supplier (required).</w:t>
+        <w:t>Pick the Supplier and enter the Quantity and Unit Cost. For a product tracked by batch, enter the Batch No. (optional) and Expiry Date (required).</w:t>
       </w:r>
     </w:p>
     <w:p>
@@ -11897,7 +11858,7 @@
         </w:numPr>
       </w:pPr>
       <w:r>
-        <w:t>Add Notes if needed and click “✓ Confirm Stock In.”</w:t>
+        <w:t>Choose how you’re paying the supplier, or Credit, and click “✓ Complete Purchase.”</w:t>
       </w:r>
     </w:p>
     <w:p>

</xml_diff>

<commit_message>
Help centre: IBS manual 1.7 (plans and add-ons, branch limit, IBS3 codes)
</commit_message>
<xml_diff>
--- a/help/ibs/IBS_User_Manual.docx
+++ b/help/ibs/IBS_User_Manual.docx
@@ -8200,7 +8200,7 @@
               <w:t xml:space="preserve">Note:  </w:t>
             </w:r>
             <w:r>
-              <w:t>Feature availability depends on your subscription plan (Core, Growth, or Enterprise) and on the permissions your administrator has given your user account. If a menu item described here is missing for you, that is most likely why — see Chapter 22, “Plan Tiers &amp; Feature Availability,” and Appendix A.</w:t>
+              <w:t>Feature availability depends on your subscription plan (Core, Growth, or Enterprise) and on the permissions your administrator has given your user account. If a menu item described here is missing for you, that is most likely why. A feature your plan doesn't include can often be added as an add-on — see Chapter 22, “Plan Tiers &amp; Feature Availability,” and Appendix A.</w:t>
             </w:r>
           </w:p>
         </w:tc>
@@ -8246,7 +8246,15 @@
         <w:pStyle w:val="ListBullet"/>
       </w:pPr>
       <w:r>
-        <w:t>Who sees profit (new in version 1.7) — on Core and Growth only the Admin role sees the business's profit; on Enterprise the new View Profit permission decides. The Dashboard is back in the menu for cashiers, without profit. See section 19.4.</w:t>
+        <w:t>Who sees profit (new in version 1.7) — on Core and Growth only the Admin role sees the business's profit; on Enterprise (or with the Custom Roles add-on) the new View Profit permission decides. The Dashboard is back in the menu for cashiers, without profit. See section 19.4.</w:t>
+      </w:r>
+    </w:p>
+    <w:p>
+      <w:pPr>
+        <w:pStyle w:val="ListBullet"/>
+      </w:pPr>
+      <w:r>
+        <w:t>Plans and add-ons (new in version 1.7) — batch &amp; expiry tracking now comes with the Growth and Enterprise plans, and damaged stock, services, and truck &amp; driver with Enterprise. On other plans each can be added as an add-on, as can extra users and, on Growth, extra branches. A feature your business already used when the system was updated stays on. Settings → General lists your add-ons. See Chapter 22.</w:t>
       </w:r>
     </w:p>
     <w:p>
@@ -8953,7 +8961,7 @@
               <w:cnfStyle w:val="000000010000" w:firstRow="0" w:lastRow="0" w:firstColumn="0" w:lastColumn="0" w:oddVBand="0" w:evenVBand="0" w:oddHBand="0" w:evenHBand="1" w:firstRowFirstColumn="0" w:firstRowLastColumn="0" w:lastRowFirstColumn="0" w:lastRowLastColumn="0"/>
             </w:pPr>
             <w:r>
-              <w:t>Sales Report, Stock Valuation, Stock by Branch, Top Selling, Low Stock Alert, Expiry Report (when batch tracking is on), and (Growth+) Receivables, Payables, Profit &amp; Loss, Dead Stock, Profit Margins, Customer Credit Settlement, Branch Performance</w:t>
+              <w:t>Sales Report, Stock Valuation, Stock by Branch, Top Selling, Low Stock Alert, Expiry Report (when batch tracking is on), Damaged Stock (when switched on), Tax Report, and (Growth+, or the Advanced Reports add-on) Receivables, Payables, Profit &amp; Loss, Dead Stock, Profit Margins, Customer Credit Settlement, Branch Performance. Profit &amp; Loss, Profit Margins, and Branch Performance only show for those who can see profit (section 19.4).</w:t>
             </w:r>
           </w:p>
         </w:tc>
@@ -10397,7 +10405,7 @@
               <w:t xml:space="preserve">Who can do this:  </w:t>
             </w:r>
             <w:r>
-              <w:t>Available on the Growth and Enterprise plans, once switched on in Settings (settings.manage). Creating, editing, printing, and converting proformas need “Access Sales / POS” (sales.access); cancelling one needs “Edit / Void Sales” (sales.edit).</w:t>
+              <w:t>Available on the Growth and Enterprise plans (on Core, as an add-on), once switched on in Settings (settings.manage). Creating, editing, printing, and converting proformas need “Access Sales / POS” (sales.access); cancelling one needs “Edit / Void Sales” (sales.edit).</w:t>
             </w:r>
           </w:p>
         </w:tc>
@@ -10814,7 +10822,7 @@
               <w:t xml:space="preserve">Who can do this:  </w:t>
             </w:r>
             <w:r>
-              <w:t>Requires “Access Sales / POS” (sales.access) and “Back-date Sales” (sales.backdate), on the Growth or Enterprise plan.</w:t>
+              <w:t>Requires “Access Sales / POS” (sales.access) and “Back-date Sales” (sales.backdate), on the Growth or Enterprise plan (on Core, with the Import &amp; Export add-on).</w:t>
             </w:r>
           </w:p>
         </w:tc>
@@ -10971,33 +10979,18 @@
         <w:rPr>
           <w:b/>
         </w:rPr>
-        <w:t>sku</w:t>
-      </w:r>
-      <w:r>
-        <w:t xml:space="preserve"> (required): the product's SKU or barcode. </w:t>
-      </w:r>
+        <w:t>sku (required): the SKU or barcode of an active product. quantity (required).</w:t>
+      </w:r>
+    </w:p>
+    <w:p>
+      <w:pPr>
+        <w:pStyle w:val="ListBullet"/>
+      </w:pPr>
       <w:r>
         <w:rPr>
           <w:b/>
         </w:rPr>
-        <w:t>quantity</w:t>
-      </w:r>
-      <w:r>
-        <w:t xml:space="preserve"> (required).</w:t>
-      </w:r>
-    </w:p>
-    <w:p>
-      <w:pPr>
-        <w:pStyle w:val="ListBullet"/>
-      </w:pPr>
-      <w:r>
-        <w:rPr>
-          <w:b/>
-        </w:rPr>
-        <w:t>receipt_number</w:t>
-      </w:r>
-      <w:r>
-        <w:t>: rows with the same receipt number are one sale; a row without one is a sale on its own. The sale's date, customer, payment, and notes come from its first row.</w:t>
+        <w:t>receipt_number: rows with the same receipt number are one sale; a row without one is a sale on its own. The sale's date, customer, payment, sale_discount, tax_percent, and notes come from its first row. The receipt number itself isn't kept — each sale gets a new sale number — so copy it into notes if you want to find the sale by it later.</w:t>
       </w:r>
     </w:p>
     <w:p>
@@ -11023,28 +11016,30 @@
         <w:rPr>
           <w:b/>
         </w:rPr>
-        <w:t>unit_price</w:t>
-      </w:r>
-      <w:r>
-        <w:t xml:space="preserve">: blank uses your branch's selling price. </w:t>
-      </w:r>
+        <w:t>unit_price: blank uses your branch's selling price; a service priced at sale (section 8.5) needs one. discount (per line) and sale_discount (the whole sale) are percentages or amounts, following your POS discount setting (section 21.5).</w:t>
+      </w:r>
+    </w:p>
+    <w:p>
+      <w:pPr>
+        <w:pStyle w:val="ListBullet"/>
+      </w:pPr>
       <w:r>
         <w:rPr>
           <w:b/>
         </w:rPr>
-        <w:t>discount</w:t>
-      </w:r>
-      <w:r>
-        <w:t xml:space="preserve"> (per line) and </w:t>
+        <w:t>payment_method</w:t>
+      </w:r>
+      <w:r>
+        <w:t xml:space="preserve">: cash, mobile, bank, credit, or deposit (blank means cash). </w:t>
       </w:r>
       <w:r>
         <w:rPr>
           <w:b/>
         </w:rPr>
-        <w:t>sale_discount</w:t>
-      </w:r>
-      <w:r>
-        <w:t xml:space="preserve"> (the whole sale) are percentages or amounts, following your POS discount setting (section 21.5).</w:t>
+        <w:t>payment_account</w:t>
+      </w:r>
+      <w:r>
+        <w:t>: an account name or number (blank means your branch's account for that method).</w:t>
       </w:r>
     </w:p>
     <w:p>
@@ -11055,19 +11050,24 @@
         <w:rPr>
           <w:b/>
         </w:rPr>
-        <w:t>payment_method</w:t>
-      </w:r>
-      <w:r>
-        <w:t xml:space="preserve">: cash, mobile, bank, credit, or deposit (blank means cash). </w:t>
-      </w:r>
+        <w:t>amount_paid</w:t>
+      </w:r>
+      <w:r>
+        <w:t>: blank means paid in full, or nothing on credit. Less than the total leaves the rest owing, as at the POS.</w:t>
+      </w:r>
+    </w:p>
+    <w:p>
+      <w:pPr>
+        <w:pStyle w:val="ListBullet"/>
+      </w:pPr>
       <w:r>
         <w:rPr>
           <w:b/>
         </w:rPr>
-        <w:t>payment_account</w:t>
-      </w:r>
-      <w:r>
-        <w:t>: an account name or number (blank means your branch's account for that method).</w:t>
+        <w:t>tax_percent</w:t>
+      </w:r>
+      <w:r>
+        <w:t>: the sale's tax rate, when tax is on (blank means your usual rate).</w:t>
       </w:r>
     </w:p>
     <w:p>
@@ -11078,10 +11078,21 @@
         <w:rPr>
           <w:b/>
         </w:rPr>
-        <w:t>amount_paid</w:t>
-      </w:r>
-      <w:r>
-        <w:t>: blank means paid in full, or nothing on credit. Less than the total leaves the rest owing, as at the POS.</w:t>
+        <w:t>notes</w:t>
+      </w:r>
+      <w:r>
+        <w:t>: kept with the sale, as at the POS.</w:t>
+      </w:r>
+    </w:p>
+    <w:p>
+      <w:pPr>
+        <w:pStyle w:val="Heading3"/>
+      </w:pPr>
+      <w:r>
+        <w:rPr>
+          <w:color w:val="1D4E89"/>
+        </w:rPr>
+        <w:t>What happens</w:t>
       </w:r>
     </w:p>
     <w:p>
@@ -11089,13 +11100,7 @@
         <w:pStyle w:val="ListBullet"/>
       </w:pPr>
       <w:r>
-        <w:rPr>
-          <w:b/>
-        </w:rPr>
-        <w:t>tax_percent</w:t>
-      </w:r>
-      <w:r>
-        <w:t>: the sale's tax rate, when tax is on (blank means your usual rate).</w:t>
+        <w:t>Sales are recorded oldest first, at your active branch, and each goes through the same checks as the POS: enough undamaged stock (not expired, if your settings refuse expired stock), walk-in customers pay in full, deposits, and credit limits.</w:t>
       </w:r>
     </w:p>
     <w:p>
@@ -11103,40 +11108,7 @@
         <w:pStyle w:val="ListBullet"/>
       </w:pPr>
       <w:r>
-        <w:rPr>
-          <w:b/>
-        </w:rPr>
-        <w:t>notes</w:t>
-      </w:r>
-      <w:r>
-        <w:t>: kept with the sale, as at the POS.</w:t>
-      </w:r>
-    </w:p>
-    <w:p>
-      <w:pPr>
-        <w:pStyle w:val="Heading3"/>
-      </w:pPr>
-      <w:r>
-        <w:rPr>
-          <w:color w:val="1D4E89"/>
-        </w:rPr>
-        <w:t>What happens</w:t>
-      </w:r>
-    </w:p>
-    <w:p>
-      <w:pPr>
-        <w:pStyle w:val="ListBullet"/>
-      </w:pPr>
-      <w:r>
-        <w:t>Sales are recorded oldest first, at your active branch, and each goes through the same checks as the POS: enough stock (not expired, if your settings refuse expired stock), walk-in customers pay in full, deposits, and credit limits.</w:t>
-      </w:r>
-    </w:p>
-    <w:p>
-      <w:pPr>
-        <w:pStyle w:val="ListBullet"/>
-      </w:pPr>
-      <w:r>
-        <w:t>Stock comes off your branch, money goes into the account, and a credit sale adds to what the customer owes, all dated sale_date, so the reports for those days include them.</w:t>
+        <w:t>Stock comes off your branch, and a credit sale adds to what the customer owes, dated sale_date, so the reports for those days include them. The money goes into the account too, but shows in the account's ledger on the day you import, as for any back-dated sale.</w:t>
       </w:r>
     </w:p>
     <w:p>
@@ -12606,7 +12578,7 @@
         <w:pStyle w:val="ListBullet"/>
       </w:pPr>
       <w:r>
-        <w:t>“Record Payment” next to an opening debt pays it from one of your accounts.</w:t>
+        <w:t>“Record Payment” next to an opening debt pays it by cash, mobile money, bank, or cheque, from the account you choose (your branch's account for that method if you leave it), dated today or an earlier Payment date.</w:t>
       </w:r>
     </w:p>
     <w:p>
@@ -13023,7 +12995,7 @@
               <w:t xml:space="preserve">Who can do this:  </w:t>
             </w:r>
             <w:r>
-              <w:t>Switching it on requires settings.manage. Setting up services requires products.manage. Selling them needs only access to the POS. Available on every plan.</w:t>
+              <w:t>Switching it on requires settings.manage. Setting up services requires products.manage. Selling them needs only access to the POS. Included in the Enterprise plan; on Core and Growth, available as an add-on.</w:t>
             </w:r>
           </w:p>
         </w:tc>
@@ -13306,7 +13278,7 @@
               <w:t xml:space="preserve">Who can do this:  </w:t>
             </w:r>
             <w:r>
-              <w:t>Switching it on requires settings.manage. Setting prices requires products.manage. Only available when your business has more than one branch (Enterprise, or the multi-branch add-on).</w:t>
+              <w:t>Switching it on requires settings.manage. Setting prices requires products.manage. Only available when your business has more than one branch (Enterprise, or extra branches on Growth).</w:t>
             </w:r>
           </w:p>
         </w:tc>
@@ -14312,7 +14284,7 @@
               <w:t xml:space="preserve">Who can do this:  </w:t>
             </w:r>
             <w:r>
-              <w:t>Switching it on requires settings.manage. Marking stock as damaged requires stock.manage and “Mark Stock as Damaged” (stock.mark_damaged), which the built-in Admin and Staff roles have and Cashier doesn't. Selling damaged stock needs only access to the POS. Available on every plan.</w:t>
+              <w:t>Switching it on requires settings.manage. Marking stock as damaged requires stock.manage and “Mark Stock as Damaged” (stock.mark_damaged), which the built-in Admin and Staff roles have and Cashier doesn't. Selling damaged stock needs only access to the POS. Included in the Enterprise plan; on Core and Growth, available as an add-on.</w:t>
             </w:r>
           </w:p>
         </w:tc>
@@ -14593,7 +14565,7 @@
               <w:t xml:space="preserve">Who can do this:  </w:t>
             </w:r>
             <w:r>
-              <w:t>Turning tracking on requires settings.manage. Choosing which products are tracked requires products.manage. Available on every plan.</w:t>
+              <w:t>Turning tracking on requires settings.manage. Choosing which products are tracked requires products.manage. Included in the Growth and Enterprise plans; on Core, available as an add-on.</w:t>
             </w:r>
           </w:p>
         </w:tc>
@@ -15100,7 +15072,7 @@
               <w:t xml:space="preserve">Who can do this:  </w:t>
             </w:r>
             <w:r>
-              <w:t>Turning it on requires settings.manage. Entering the details needs only access to the screen itself (POS, Purchases, or Direct Deliveries); correcting them on an existing sale needs “Edit / Void Sales”. Available on every plan.</w:t>
+              <w:t>Turning it on requires settings.manage. Entering the details needs only access to the screen itself (POS, Purchases, or Direct Deliveries); correcting them on an existing sale needs “Edit / Void Sales”. Included in the Enterprise plan; on Core and Growth, available as an add-on.</w:t>
             </w:r>
           </w:p>
         </w:tc>
@@ -15571,7 +15543,7 @@
         <w:pStyle w:val="ListBullet"/>
       </w:pPr>
       <w:r>
-        <w:t>Both sales exports: the Sales History export (Finance → Sales → Export) as truck_number, driver_name, and driver_phone columns, and the Sales Report export (Reports → Sales Report) as Truck, Driver, and Driver's Phone columns</w:t>
+        <w:t>Both sales exports: the Sales History export (Finance → Sales → “📤 Export Filtered”) as truck_number, driver_name, and driver_phone columns, and the Sales Report export (Reports → Sales Report) as Truck, Driver, and Driver's Phone columns</w:t>
       </w:r>
     </w:p>
     <w:tbl>
@@ -16625,7 +16597,7 @@
               <w:t xml:space="preserve">Who can do this:  </w:t>
             </w:r>
             <w:r>
-              <w:t>Requires distributor.manage, and is only available on plans that include the Direct Deliveries feature (typically Enterprise).</w:t>
+              <w:t>Requires distributor.manage, and is only available on plans that include the Direct Deliveries feature (Enterprise, or the Distributor Deliveries add-on on Growth).</w:t>
             </w:r>
           </w:p>
         </w:tc>
@@ -16840,7 +16812,7 @@
               <w:t xml:space="preserve">Who can do this:  </w:t>
             </w:r>
             <w:r>
-              <w:t>Viewing requires financial_accounts.access. Adding a new account additionally requires the Growth+ “manage financial accounts” plan feature.</w:t>
+              <w:t>Viewing requires financial_accounts.access. Adding a new account additionally requires the Growth+ “manage financial accounts” plan feature (on Core, the Finance Pack add-on).</w:t>
             </w:r>
           </w:p>
         </w:tc>
@@ -17308,7 +17280,7 @@
               <w:t xml:space="preserve">Who can do this:  </w:t>
             </w:r>
             <w:r>
-              <w:t>Requires expenses.manage and the Growth+ “expenses” plan feature.</w:t>
+              <w:t>Requires expenses.manage and the Growth+ “expenses” plan feature (on Core, the Finance Pack add-on).</w:t>
             </w:r>
           </w:p>
         </w:tc>
@@ -17492,7 +17464,7 @@
               <w:t xml:space="preserve">Who can do this:  </w:t>
             </w:r>
             <w:r>
-              <w:t>Requires suspense.manage and the Growth+ “suspense” plan feature.</w:t>
+              <w:t>Requires suspense.manage and the Growth+ “suspense” plan feature (on Core, the Finance Pack add-on).</w:t>
             </w:r>
           </w:p>
         </w:tc>
@@ -18003,6 +17975,11 @@
       </w:r>
       <w:bookmarkEnd w:id="93"/>
     </w:p>
+    <w:p>
+      <w:r>
+        <w:t>On the Core plan, the Advanced Reports add-on adds these reports.</w:t>
+      </w:r>
+    </w:p>
     <w:tbl>
       <w:tblPr>
         <w:tblStyle w:val="LightGrid-Accent1"/>
@@ -18547,7 +18524,7 @@
         <w:t>Core and Growth:</w:t>
       </w:r>
       <w:r>
-        <w:t xml:space="preserve"> users with the Admin role.</w:t>
+        <w:t xml:space="preserve"> users with the Admin role, unless your plan has custom roles.</w:t>
       </w:r>
     </w:p>
     <w:p>
@@ -18561,7 +18538,7 @@
         <w:t>Enterprise:</w:t>
       </w:r>
       <w:r>
-        <w:t xml:space="preserve"> users whose role has the View Profit permission (profit.view). The Admin role has it, and you can give it to any other role (section 21.2).</w:t>
+        <w:t xml:space="preserve"> users whose role has the View Profit permission (profit.view). The Admin role has it, and you can give it to any other role (section 21.2). This also applies on Growth with the Custom Roles add-on.</w:t>
       </w:r>
     </w:p>
     <w:p>
@@ -18627,7 +18604,7 @@
               <w:t xml:space="preserve">Note:  </w:t>
             </w:r>
             <w:r>
-              <w:t>Product costs, and the margin on a product's own page, are still shown to anyone who can see products. Cashiers land on the POS when they log in, and can open the Dashboard from the menu for its stock alerts.</w:t>
+              <w:t>Product costs, and the margin on a product's own page, are still shown to anyone who can see products. Cashiers land on the POS when they log in, and can open the Dashboard from the menu for its stock alerts. Direct Deliveries still show their markup to anyone who can manage them (Chapter 14).</w:t>
             </w:r>
           </w:p>
         </w:tc>
@@ -18682,7 +18659,7 @@
               <w:t xml:space="preserve">Who can do this:  </w:t>
             </w:r>
             <w:r>
-              <w:t>Requires the Growth+ “imports/exports” plan feature, plus the matching module permission for the data you're importing/exporting. Audit Log export is exempt from the plan requirement, for compliance reasons.</w:t>
+              <w:t>Requires the Growth+ “imports/exports” plan feature (on Core, the Import &amp; Export add-on), plus the matching module permission for the data you're importing/exporting. Audit Log export is exempt from the plan requirement, for compliance reasons.</w:t>
             </w:r>
           </w:p>
         </w:tc>
@@ -19361,7 +19338,7 @@
               <w:t xml:space="preserve">Note:  </w:t>
             </w:r>
             <w:r>
-              <w:t>Your plan caps how many active users you can have: 3 on Core, 8 on Growth, unlimited on Enterprise.</w:t>
+              <w:t>Your plan caps how many active users you can have: 3 on Core, 8 on Growth, unlimited on Enterprise. Extra users can be added to Core and Growth as an add-on; Settings → General shows your limit. Reactivating a user also needs a free place.</w:t>
             </w:r>
           </w:p>
         </w:tc>
@@ -19457,7 +19434,7 @@
               <w:t xml:space="preserve">Who can do this:  </w:t>
             </w:r>
             <w:r>
-              <w:t>Requires roles.manage, and the Enterprise “advanced permissions” plan feature (custom roles are not available on Core or Growth).</w:t>
+              <w:t>Requires roles.manage, and custom roles: included in Enterprise, an add-on on Growth, and not available on Core.</w:t>
             </w:r>
           </w:p>
         </w:tc>
@@ -20443,7 +20420,7 @@
               <w:t xml:space="preserve">Who can do this:  </w:t>
             </w:r>
             <w:r>
-              <w:t>Requires branches.manage, and multi-branch enabled on your account (automatic on Enterprise, purchasable as an add-on on Growth).</w:t>
+              <w:t>Requires branches.manage. Core and Growth include one branch, and Growth can add more as an add-on; Enterprise has no limit.</w:t>
             </w:r>
           </w:p>
         </w:tc>
@@ -20491,6 +20468,11 @@
     <w:p>
       <w:r>
         <w:t>The new branch automatically gets its own Cash account (see section 15.1).</w:t>
+      </w:r>
+    </w:p>
+    <w:p>
+      <w:r>
+        <w:t>The Branches page shows how many of your branches are in use. When they all are, “+ Add Branch” is replaced by “All your branches are in use. Contact your provider to add another.” Reactivating a branch also needs a free place.</w:t>
       </w:r>
     </w:p>
     <w:tbl>
@@ -20762,7 +20744,7 @@
               <w:cnfStyle w:val="000000100000" w:firstRow="0" w:lastRow="0" w:firstColumn="0" w:lastColumn="0" w:oddVBand="0" w:evenVBand="0" w:oddHBand="1" w:evenHBand="0" w:firstRowFirstColumn="0" w:firstRowLastColumn="0" w:lastRowFirstColumn="0" w:lastRowLastColumn="0"/>
             </w:pPr>
             <w:r>
-              <w:t>Your plan and its user limit. Upgrading isn't self-service; contact your provider.</w:t>
+              <w:t>Your plan, any add-ons, and how many users you can have. Changing plans or adding features isn't self-service; contact your provider.</w:t>
             </w:r>
           </w:p>
         </w:tc>
@@ -21010,7 +20992,7 @@
               <w:cnfStyle w:val="000000100000" w:firstRow="0" w:lastRow="0" w:firstColumn="0" w:lastColumn="0" w:oddVBand="0" w:evenVBand="0" w:oddHBand="1" w:evenHBand="0" w:firstRowFirstColumn="0" w:firstRowLastColumn="0" w:lastRowFirstColumn="0" w:lastRowLastColumn="0"/>
             </w:pPr>
             <w:r>
-              <w:t>Adds optional truck number, driver's name, and driver's phone fields to the POS, purchases, and direct deliveries. See Chapter 11.</w:t>
+              <w:t>Enterprise, or an add-on. Adds optional truck number, driver's name, and driver's phone fields to the POS, purchases, and direct deliveries. See Chapter 11.</w:t>
             </w:r>
           </w:p>
         </w:tc>
@@ -21041,7 +21023,7 @@
               <w:cnfStyle w:val="000000010000" w:firstRow="0" w:lastRow="0" w:firstColumn="0" w:lastColumn="0" w:oddVBand="0" w:evenVBand="0" w:oddHBand="0" w:evenHBand="1" w:firstRowFirstColumn="0" w:firstRowLastColumn="0" w:lastRowFirstColumn="0" w:lastRowLastColumn="0"/>
             </w:pPr>
             <w:r>
-              <w:t>Turns batch and expiry tracking on; the “expiring soon” warning period and whether expired stock can be sold appear under it. See Chapter 10.</w:t>
+              <w:t>Growth &amp; Enterprise, or an add-on. Turns batch and expiry tracking on; the “expiring soon” warning period and whether expired stock can be sold appear under it. See Chapter 10.</w:t>
             </w:r>
           </w:p>
         </w:tc>
@@ -21072,7 +21054,7 @@
               <w:cnfStyle w:val="000000100000" w:firstRow="0" w:lastRow="0" w:firstColumn="0" w:lastColumn="0" w:oddVBand="0" w:evenVBand="0" w:oddHBand="1" w:evenHBand="0" w:firstRowFirstColumn="0" w:firstRowLastColumn="0" w:lastRowFirstColumn="0" w:lastRowLastColumn="0"/>
             </w:pPr>
             <w:r>
-              <w:t>Lets a product be set up as a service, which sells with no stock. See section 8.5.</w:t>
+              <w:t>Enterprise, or an add-on. Lets a product be set up as a service, which sells with no stock. See section 8.5.</w:t>
             </w:r>
           </w:p>
         </w:tc>
@@ -21134,7 +21116,7 @@
               <w:cnfStyle w:val="000000100000" w:firstRow="0" w:lastRow="0" w:firstColumn="0" w:lastColumn="0" w:oddVBand="0" w:evenVBand="0" w:oddHBand="1" w:evenHBand="0" w:firstRowFirstColumn="0" w:firstRowLastColumn="0" w:lastRowFirstColumn="0" w:lastRowLastColumn="0"/>
             </w:pPr>
             <w:r>
-              <w:t>Keeps count of damaged goods that may still be sold at a discount, and adds the Damaged Stock report. See section 9.4.</w:t>
+              <w:t>Enterprise, or an add-on. Keeps count of damaged goods that may still be sold at a discount, and adds the Damaged Stock report. See section 9.4.</w:t>
             </w:r>
           </w:p>
         </w:tc>
@@ -21237,7 +21219,7 @@
               <w:t xml:space="preserve">Note:  </w:t>
             </w:r>
             <w:r>
-              <w:t>If the Tax section, or the truck &amp; driver, services, proforma, or damaged stock switch, is missing, your installation hasn't had that update yet — contact your provider. On the Core plan, Proforma invoices shows as not included. The branch price and branch cost switches only show when your business has more than one branch.</w:t>
+              <w:t>If the Tax section, or the truck &amp; driver, services, proforma, or damaged stock switch, is missing, your installation hasn't had that update yet — contact your provider. On the Core plan, Proforma invoices shows as not included. A truck &amp; driver, batch &amp; expiry, services, or damaged stock switch your plan doesn't include shows “Included in the … plan, or available for your … plan as an add-on. Contact your provider to add it.” instead. One your business already used when the system was updated stays on. The branch price and branch cost switches only show when your business has more than one branch.</w:t>
             </w:r>
           </w:p>
         </w:tc>
@@ -21477,7 +21459,7 @@
         </w:numPr>
       </w:pPr>
       <w:r>
-        <w:t>Paste the full code exactly as received (it starts “IBS2-”) into “Enter unlock code” and click “Activate.”</w:t>
+        <w:t>Paste the full code exactly as received (it starts “IBS3-”; older “IBS2-” codes still work) into “Enter unlock code” and click “Activate.”</w:t>
       </w:r>
     </w:p>
     <w:tbl>
@@ -21519,6 +21501,46 @@
         </w:tc>
       </w:tr>
     </w:tbl>
+    <w:p/>
+    <w:tbl>
+      <w:tblPr>
+        <w:tblW w:w="0" w:type="auto"/>
+        <w:tblBorders>
+          <w:top w:val="nil"/>
+          <w:left w:val="nil"/>
+          <w:bottom w:val="nil"/>
+          <w:right w:val="nil"/>
+          <w:insideH w:val="nil"/>
+          <w:insideV w:val="nil"/>
+        </w:tblBorders>
+        <w:tblLook w:val="04A0" w:firstRow="1" w:lastRow="0" w:firstColumn="1" w:lastColumn="0" w:noHBand="0" w:noVBand="1"/>
+      </w:tblPr>
+      <w:tblGrid>
+        <w:gridCol w:w="8640"/>
+      </w:tblGrid>
+      <w:tr>
+        <w:trPr>
+          <w:cantSplit/>
+        </w:trPr>
+        <w:tc>
+          <w:tcPr>
+            <w:tcW w:w="8640" w:type="dxa"/>
+            <w:shd w:val="clear" w:color="auto" w:fill="EAF1FB"/>
+          </w:tcPr>
+          <w:p>
+            <w:r>
+              <w:rPr>
+                <w:b/>
+              </w:rPr>
+              <w:t xml:space="preserve">Note:  </w:t>
+            </w:r>
+            <w:r>
+              <w:t>An IBS3 code also carries your plan, add-ons, and extra users and branches: entering it sets them to exactly what the code lists. A code older than one already entered is refused with “A newer code has already been entered on this installation.”</w:t>
+            </w:r>
+          </w:p>
+        </w:tc>
+      </w:tr>
+    </w:tbl>
     <w:p>
       <w:pPr>
         <w:pStyle w:val="Heading1"/>
@@ -21537,6 +21559,11 @@
     <w:p>
       <w:r>
         <w:t>The system ships in three tiers — Core, Growth, and Enterprise — from a single codebase. Your plan is set on the server side; there's no self-service upgrade button. Contact your provider to change tiers.</w:t>
+      </w:r>
+    </w:p>
+    <w:p>
+      <w:r>
+        <w:t>Most features a plan leaves out can be added to it as an add-on, for an extra fee: they're marked “Add-on” below. The expenses, suspense, and new-account features come together as the Finance Pack add-on. Settings → General → Current plan lists the add-ons you have.</w:t>
       </w:r>
     </w:p>
     <w:tbl>
@@ -21750,7 +21777,7 @@
               <w:cnfStyle w:val="000000100000" w:firstRow="0" w:lastRow="0" w:firstColumn="0" w:lastColumn="0" w:oddVBand="0" w:evenVBand="0" w:oddHBand="1" w:evenHBand="0" w:firstRowFirstColumn="0" w:firstRowLastColumn="0" w:lastRowFirstColumn="0" w:lastRowLastColumn="0"/>
             </w:pPr>
             <w:r>
-              <w:t>Yes</w:t>
+              <w:t>Add-on</w:t>
             </w:r>
           </w:p>
         </w:tc>
@@ -21807,7 +21834,7 @@
               <w:cnfStyle w:val="000000010000" w:firstRow="0" w:lastRow="0" w:firstColumn="0" w:lastColumn="0" w:oddVBand="0" w:evenVBand="0" w:oddHBand="0" w:evenHBand="1" w:firstRowFirstColumn="0" w:firstRowLastColumn="0" w:lastRowFirstColumn="0" w:lastRowLastColumn="0"/>
             </w:pPr>
             <w:r>
-              <w:t>Yes</w:t>
+              <w:t>Add-on</w:t>
             </w:r>
           </w:p>
         </w:tc>
@@ -21820,7 +21847,7 @@
               <w:cnfStyle w:val="000000010000" w:firstRow="0" w:lastRow="0" w:firstColumn="0" w:lastColumn="0" w:oddVBand="0" w:evenVBand="0" w:oddHBand="0" w:evenHBand="1" w:firstRowFirstColumn="0" w:firstRowLastColumn="0" w:lastRowFirstColumn="0" w:lastRowLastColumn="0"/>
             </w:pPr>
             <w:r>
-              <w:t>Yes</w:t>
+              <w:t>Add-on</w:t>
             </w:r>
           </w:p>
         </w:tc>
@@ -21921,7 +21948,7 @@
               <w:cnfStyle w:val="000000010000" w:firstRow="0" w:lastRow="0" w:firstColumn="0" w:lastColumn="0" w:oddVBand="0" w:evenVBand="0" w:oddHBand="0" w:evenHBand="1" w:firstRowFirstColumn="0" w:firstRowLastColumn="0" w:lastRowFirstColumn="0" w:lastRowLastColumn="0"/>
             </w:pPr>
             <w:r>
-              <w:t>Yes</w:t>
+              <w:t>Add-on</w:t>
             </w:r>
           </w:p>
         </w:tc>
@@ -21934,7 +21961,7 @@
               <w:cnfStyle w:val="000000010000" w:firstRow="0" w:lastRow="0" w:firstColumn="0" w:lastColumn="0" w:oddVBand="0" w:evenVBand="0" w:oddHBand="0" w:evenHBand="1" w:firstRowFirstColumn="0" w:firstRowLastColumn="0" w:lastRowFirstColumn="0" w:lastRowLastColumn="0"/>
             </w:pPr>
             <w:r>
-              <w:t>Yes</w:t>
+              <w:t>Add-on</w:t>
             </w:r>
           </w:p>
         </w:tc>
@@ -21978,7 +22005,7 @@
               <w:cnfStyle w:val="000000100000" w:firstRow="0" w:lastRow="0" w:firstColumn="0" w:lastColumn="0" w:oddVBand="0" w:evenVBand="0" w:oddHBand="1" w:evenHBand="0" w:firstRowFirstColumn="0" w:firstRowLastColumn="0" w:lastRowFirstColumn="0" w:lastRowLastColumn="0"/>
             </w:pPr>
             <w:r>
-              <w:t>Yes</w:t>
+              <w:t>Add-on</w:t>
             </w:r>
           </w:p>
         </w:tc>
@@ -21991,7 +22018,7 @@
               <w:cnfStyle w:val="000000100000" w:firstRow="0" w:lastRow="0" w:firstColumn="0" w:lastColumn="0" w:oddVBand="0" w:evenVBand="0" w:oddHBand="1" w:evenHBand="0" w:firstRowFirstColumn="0" w:firstRowLastColumn="0" w:lastRowFirstColumn="0" w:lastRowLastColumn="0"/>
             </w:pPr>
             <w:r>
-              <w:t>Yes</w:t>
+              <w:t>Add-on</w:t>
             </w:r>
           </w:p>
         </w:tc>
@@ -22035,7 +22062,7 @@
               <w:cnfStyle w:val="000000010000" w:firstRow="0" w:lastRow="0" w:firstColumn="0" w:lastColumn="0" w:oddVBand="0" w:evenVBand="0" w:oddHBand="0" w:evenHBand="1" w:firstRowFirstColumn="0" w:firstRowLastColumn="0" w:lastRowFirstColumn="0" w:lastRowLastColumn="0"/>
             </w:pPr>
             <w:r>
-              <w:t>—</w:t>
+              <w:t>Add-on</w:t>
             </w:r>
           </w:p>
         </w:tc>
@@ -22092,7 +22119,7 @@
               <w:cnfStyle w:val="000000100000" w:firstRow="0" w:lastRow="0" w:firstColumn="0" w:lastColumn="0" w:oddVBand="0" w:evenVBand="0" w:oddHBand="1" w:evenHBand="0" w:firstRowFirstColumn="0" w:firstRowLastColumn="0" w:lastRowFirstColumn="0" w:lastRowLastColumn="0"/>
             </w:pPr>
             <w:r>
-              <w:t>—</w:t>
+              <w:t>Add-on</w:t>
             </w:r>
           </w:p>
         </w:tc>
@@ -22149,7 +22176,7 @@
               <w:cnfStyle w:val="000000010000" w:firstRow="0" w:lastRow="0" w:firstColumn="0" w:lastColumn="0" w:oddVBand="0" w:evenVBand="0" w:oddHBand="0" w:evenHBand="1" w:firstRowFirstColumn="0" w:firstRowLastColumn="0" w:lastRowFirstColumn="0" w:lastRowLastColumn="0"/>
             </w:pPr>
             <w:r>
-              <w:t>—</w:t>
+              <w:t>Add-on</w:t>
             </w:r>
           </w:p>
         </w:tc>
@@ -22206,7 +22233,7 @@
               <w:cnfStyle w:val="000000100000" w:firstRow="0" w:lastRow="0" w:firstColumn="0" w:lastColumn="0" w:oddVBand="0" w:evenVBand="0" w:oddHBand="1" w:evenHBand="0" w:firstRowFirstColumn="0" w:firstRowLastColumn="0" w:lastRowFirstColumn="0" w:lastRowLastColumn="0"/>
             </w:pPr>
             <w:r>
-              <w:t>—</w:t>
+              <w:t>Finance Pack add-on</w:t>
             </w:r>
           </w:p>
         </w:tc>
@@ -22320,7 +22347,7 @@
               <w:cnfStyle w:val="000000100000" w:firstRow="0" w:lastRow="0" w:firstColumn="0" w:lastColumn="0" w:oddVBand="0" w:evenVBand="0" w:oddHBand="1" w:evenHBand="0" w:firstRowFirstColumn="0" w:firstRowLastColumn="0" w:lastRowFirstColumn="0" w:lastRowLastColumn="0"/>
             </w:pPr>
             <w:r>
-              <w:t>—</w:t>
+              <w:t>Finance Pack add-on</w:t>
             </w:r>
           </w:p>
         </w:tc>
@@ -22377,7 +22404,7 @@
               <w:cnfStyle w:val="000000010000" w:firstRow="0" w:lastRow="0" w:firstColumn="0" w:lastColumn="0" w:oddVBand="0" w:evenVBand="0" w:oddHBand="0" w:evenHBand="1" w:firstRowFirstColumn="0" w:firstRowLastColumn="0" w:lastRowFirstColumn="0" w:lastRowLastColumn="0"/>
             </w:pPr>
             <w:r>
-              <w:t>—</w:t>
+              <w:t>Finance Pack add-on</w:t>
             </w:r>
           </w:p>
         </w:tc>
@@ -22447,7 +22474,7 @@
               <w:cnfStyle w:val="000000100000" w:firstRow="0" w:lastRow="0" w:firstColumn="0" w:lastColumn="0" w:oddVBand="0" w:evenVBand="0" w:oddHBand="1" w:evenHBand="0" w:firstRowFirstColumn="0" w:firstRowLastColumn="0" w:lastRowFirstColumn="0" w:lastRowLastColumn="0"/>
             </w:pPr>
             <w:r>
-              <w:t>—</w:t>
+              <w:t>Add-on</w:t>
             </w:r>
           </w:p>
         </w:tc>
@@ -22504,7 +22531,7 @@
               <w:cnfStyle w:val="000000010000" w:firstRow="0" w:lastRow="0" w:firstColumn="0" w:lastColumn="0" w:oddVBand="0" w:evenVBand="0" w:oddHBand="0" w:evenHBand="1" w:firstRowFirstColumn="0" w:firstRowLastColumn="0" w:lastRowFirstColumn="0" w:lastRowLastColumn="0"/>
             </w:pPr>
             <w:r>
-              <w:t>Add-on</w:t>
+              <w:t>Add-on, per extra branch</w:t>
             </w:r>
           </w:p>
         </w:tc>
@@ -22675,7 +22702,7 @@
               <w:cnfStyle w:val="000000100000" w:firstRow="0" w:lastRow="0" w:firstColumn="0" w:lastColumn="0" w:oddVBand="0" w:evenVBand="0" w:oddHBand="1" w:evenHBand="0" w:firstRowFirstColumn="0" w:firstRowLastColumn="0" w:lastRowFirstColumn="0" w:lastRowLastColumn="0"/>
             </w:pPr>
             <w:r>
-              <w:t>—</w:t>
+              <w:t>Add-on</w:t>
             </w:r>
           </w:p>
         </w:tc>
@@ -22732,7 +22759,7 @@
               <w:cnfStyle w:val="000000010000" w:firstRow="0" w:lastRow="0" w:firstColumn="0" w:lastColumn="0" w:oddVBand="0" w:evenVBand="0" w:oddHBand="0" w:evenHBand="1" w:firstRowFirstColumn="0" w:firstRowLastColumn="0" w:lastRowFirstColumn="0" w:lastRowLastColumn="0"/>
             </w:pPr>
             <w:r>
-              <w:t>Admin role</w:t>
+              <w:t>Admin role (View Profit permission with the Custom Roles add-on)</w:t>
             </w:r>
           </w:p>
         </w:tc>
@@ -22776,7 +22803,7 @@
               <w:cnfStyle w:val="000000100000" w:firstRow="0" w:lastRow="0" w:firstColumn="0" w:lastColumn="0" w:oddVBand="0" w:evenVBand="0" w:oddHBand="1" w:evenHBand="0" w:firstRowFirstColumn="0" w:firstRowLastColumn="0" w:lastRowFirstColumn="0" w:lastRowLastColumn="0"/>
             </w:pPr>
             <w:r>
-              <w:t>3</w:t>
+              <w:t>3, more as an add-on</w:t>
             </w:r>
           </w:p>
         </w:tc>
@@ -22789,7 +22816,7 @@
               <w:cnfStyle w:val="000000100000" w:firstRow="0" w:lastRow="0" w:firstColumn="0" w:lastColumn="0" w:oddVBand="0" w:evenVBand="0" w:oddHBand="1" w:evenHBand="0" w:firstRowFirstColumn="0" w:firstRowLastColumn="0" w:lastRowFirstColumn="0" w:lastRowLastColumn="0"/>
             </w:pPr>
             <w:r>
-              <w:t>8</w:t>
+              <w:t>8, more as an add-on</w:t>
             </w:r>
           </w:p>
         </w:tc>
@@ -22884,7 +22911,7 @@
     </w:p>
     <w:p>
       <w:r>
-        <w:t>Two possible reasons: your user account doesn't have the matching permission (ask an administrator to check Roles &amp; Permissions), or the feature isn't included in your plan tier (see Chapter 22). Some items also only appear when a feature is switched on — Stock Transfers needs multi-branch, and the Expiry Report needs batch tracking.</w:t>
+        <w:t>Two possible reasons: your user account doesn't have the matching permission (ask an administrator to check Roles &amp; Permissions), or the feature isn't included in your plan tier and hasn't been added as an add-on (see Chapter 22). Some items also only appear when a feature is switched on — Stock Transfers needs multi-branch, and the Expiry Report needs batch tracking.</w:t>
       </w:r>
     </w:p>
     <w:p>
@@ -23174,7 +23201,7 @@
     </w:p>
     <w:p>
       <w:r>
-        <w:t>Profit is only shown to those allowed to see it: the Admin role on Core and Growth, or roles with the View Profit permission on Enterprise (section 19.4). Ask your administrator.</w:t>
+        <w:t>Profit is only shown to those allowed to see it: the Admin role on Core and Growth, or roles with the View Profit permission on Enterprise or with the Custom Roles add-on (section 19.4). Ask your administrator.</w:t>
       </w:r>
     </w:p>
     <w:p>
@@ -23223,6 +23250,22 @@
     <w:p>
       <w:r>
         <w:t>A payment made on the supplier's own page isn't tied to one purchase, so it counts against their oldest purchases and opening debts first (section 7.3). Record Payment starts at what's still owed.</w:t>
+      </w:r>
+    </w:p>
+    <w:p>
+      <w:pPr>
+        <w:pStyle w:val="Heading3"/>
+      </w:pPr>
+      <w:r>
+        <w:rPr>
+          <w:color w:val="1D4E89"/>
+        </w:rPr>
+        <w:t>A switch in Settings → Optional features says it's included in another plan.</w:t>
+      </w:r>
+    </w:p>
+    <w:p>
+      <w:r>
+        <w:t>Your plan doesn't include that feature, so it can't be switched on. It can be added as an add-on: contact your provider (Chapter 22).</w:t>
       </w:r>
     </w:p>
     <w:p>

</xml_diff>

<commit_message>
Help centre: IBS manual, sales import takes truck and driver
</commit_message>
<xml_diff>
--- a/help/ibs/IBS_User_Manual.docx
+++ b/help/ibs/IBS_User_Manual.docx
@@ -11086,6 +11086,17 @@
     </w:p>
     <w:p>
       <w:pPr>
+        <w:pStyle w:val="ListBullet"/>
+      </w:pPr>
+      <w:r>
+        <w:rPr>
+          <w:b/>
+        </w:rPr>
+        <w:t>truck_number, driver_name, driver_phone: while truck &amp; driver recording is on (Chapter 11), optional. They belong to the whole sale and are taken from its first row that has them, with the same rules as at the POS (section 11.3). A driver_phone that isn't a phone number marks its row as an error in the preview.</w:t>
+      </w:r>
+    </w:p>
+    <w:p>
+      <w:pPr>
         <w:pStyle w:val="Heading3"/>
       </w:pPr>
       <w:r>
@@ -15381,6 +15392,37 @@
           </w:p>
         </w:tc>
       </w:tr>
+      <w:tr>
+        <w:trPr>
+          <w:cnfStyle w:val="000000100000" w:firstRow="0" w:lastRow="0" w:firstColumn="0" w:lastColumn="0" w:oddVBand="0" w:evenVBand="0" w:oddHBand="1" w:evenHBand="0" w:firstRowFirstColumn="0" w:firstRowLastColumn="0" w:lastRowFirstColumn="0" w:lastRowLastColumn="0"/>
+          <w:cantSplit/>
+          <w:jc w:val="center"/>
+        </w:trPr>
+        <w:tc>
+          <w:tcPr>
+            <w:cnfStyle w:val="001000000000" w:firstRow="0" w:lastRow="0" w:firstColumn="1" w:lastColumn="0" w:oddVBand="0" w:evenVBand="0" w:oddHBand="0" w:evenHBand="0" w:firstRowFirstColumn="0" w:firstRowLastColumn="0" w:lastRowFirstColumn="0" w:lastRowLastColumn="0"/>
+            <w:tcW w:w="4320" w:type="dxa"/>
+          </w:tcPr>
+          <w:p>
+            <w:r>
+              <w:t>Sales import (CSV)</w:t>
+            </w:r>
+          </w:p>
+        </w:tc>
+        <w:tc>
+          <w:tcPr>
+            <w:tcW w:w="4320" w:type="dxa"/>
+          </w:tcPr>
+          <w:p>
+            <w:pPr>
+              <w:cnfStyle w:val="000000100000" w:firstRow="0" w:lastRow="0" w:firstColumn="0" w:lastColumn="0" w:oddVBand="0" w:evenVBand="0" w:oddHBand="1" w:evenHBand="0" w:firstRowFirstColumn="0" w:firstRowLastColumn="0" w:lastRowFirstColumn="0" w:lastRowLastColumn="0"/>
+            </w:pPr>
+            <w:r>
+              <w:t>Optional truck_number, driver_name, and driver_phone columns, one truck per sale — see sections 4.7 and 11.5.</w:t>
+            </w:r>
+          </w:p>
+        </w:tc>
+      </w:tr>
     </w:tbl>
     <w:p/>
     <w:tbl>
@@ -15644,6 +15686,17 @@
       </w:r>
       <w:r>
         <w:t xml:space="preserve"> a driver_phone that isn't a phone number marks that row as an error in the preview, and it isn't imported until it's corrected or cleared.</w:t>
+      </w:r>
+    </w:p>
+    <w:p>
+      <w:pPr>
+        <w:pStyle w:val="ListBullet"/>
+      </w:pPr>
+      <w:r>
+        <w:rPr>
+          <w:b/>
+        </w:rPr>
+        <w:t>The sales import (section 4.7) takes the same three columns, with the same rules: rows with the same receipt_number are one sale, so the truck and driver are taken from that sale's first row that has them.</w:t>
       </w:r>
     </w:p>
     <w:p>
@@ -19030,7 +19083,7 @@
               <w:cnfStyle w:val="000000010000" w:firstRow="0" w:lastRow="0" w:firstColumn="0" w:lastColumn="0" w:oddVBand="0" w:evenVBand="0" w:oddHBand="0" w:evenHBand="1" w:firstRowFirstColumn="0" w:firstRowLastColumn="0" w:lastRowFirstColumn="0" w:lastRowLastColumn="0"/>
             </w:pPr>
             <w:r>
-              <w:t>sale_date, sku, quantity. Sales made between a stock count and your first day on IBS; rows sharing a receipt_number become one sale. Needs Back-date Sales. See section 4.7.</w:t>
+              <w:t>sale_date, sku, quantity. Sales made between a stock count and your first day on IBS; rows sharing a receipt_number become one sale. Optional truck_number, driver_name, and driver_phone while truck &amp; driver is on. Needs Back-date Sales. See section 4.7.</w:t>
             </w:r>
           </w:p>
         </w:tc>

</xml_diff>

<commit_message>
Help centre: IBS manual 1.8 (POS "Selling from" branch label)
Rebuilt the IBS pages from manual 1.8: the POS chapter, branch switcher
section, what's new and FAQ now cover the "Selling from" label. Haulage
pages unchanged.
</commit_message>
<xml_diff>
--- a/help/ibs/IBS_User_Manual.docx
+++ b/help/ibs/IBS_User_Manual.docx
@@ -40,7 +40,7 @@
         <w:rPr>
           <w:color w:val="333333"/>
         </w:rPr>
-        <w:t>Version 1.7  |  October 2026</w:t>
+        <w:t>Version 1.8  |  October 2026</w:t>
       </w:r>
     </w:p>
     <w:p>
@@ -8223,6 +8223,15 @@
     <w:p>
       <w:r>
         <w:t>If you used the system with version 1.0 of this manual, these are the changes you'll notice:</w:t>
+      </w:r>
+    </w:p>
+    <w:p>
+      <w:pPr>
+        <w:pStyle w:val="ListBullet"/>
+      </w:pPr>
+      <w:r>
+        <w:rPr/>
+        <w:t>The POS shows which branch you're selling from (multi-branch, new in version 1.8) — a “🏢 Selling from” label under the POS heading names the branch each sale is recorded at, and turns amber while a company-wide user is viewing 🌐 All branches. See sections 2.3 and 3.1.</w:t>
       </w:r>
     </w:p>
     <w:p>
@@ -9095,7 +9104,7 @@
         <w:t>🌐 All branches</w:t>
       </w:r>
       <w:r>
-        <w:t xml:space="preserve"> option. It combines every branch in lists and reports, but only changes what you see — new sales and stock changes still go to your active branch, which the dropdown's tooltip names.</w:t>
+        <w:t xml:space="preserve"> option. It combines every branch in lists and reports, but only changes what you see — new sales and stock changes still go to your active branch, which the dropdown's tooltip names. The POS also shows it under its heading as “🏢 Selling from” (section 3.1).</w:t>
       </w:r>
     </w:p>
     <w:p>
@@ -9460,6 +9469,18 @@
       </w:pPr>
       <w:r>
         <w:t>Click “✓ Complete Sale.” A receipt appears with options to Print, start a New sale, or Close.</w:t>
+      </w:r>
+    </w:p>
+    <w:p>
+      <w:r>
+        <w:rPr>
+          <w:b/>
+        </w:rPr>
+        <w:t xml:space="preserve">Which branch the sale goes to. </w:t>
+      </w:r>
+      <w:r>
+        <w:rPr/>
+        <w:t>If your business has more than one branch, a “🏢 Selling from” label under the POS heading names the branch the sale will be recorded at, and whose stock it uses. For a company-wide user viewing 🌐 All branches the label turns amber, as a reminder that the sale still goes to your active branch: to sell from a different branch, pick it in the branch switcher at the top first (section 2.3).</w:t>
       </w:r>
     </w:p>
     <w:tbl>
@@ -23323,6 +23344,23 @@
     </w:p>
     <w:p>
       <w:pPr>
+        <w:pStyle w:val="Heading3"/>
+      </w:pPr>
+      <w:r>
+        <w:rPr>
+          <w:color w:val="1D4E89"/>
+        </w:rPr>
+        <w:t>I sold something while viewing All branches. Which branch got the sale?</w:t>
+      </w:r>
+    </w:p>
+    <w:p>
+      <w:r>
+        <w:rPr/>
+        <w:t>Your active branch — the one named in the “🏢 Selling from” label at the top of the POS. “All branches” only combines what you see in lists and reports. To sell from another branch, pick that branch in the switcher at the top before ringing up the sale (section 2.3).</w:t>
+      </w:r>
+    </w:p>
+    <w:p>
+      <w:pPr>
         <w:pStyle w:val="Heading1"/>
       </w:pPr>
       <w:bookmarkStart w:id="109" w:name="_Toc243479305"/>
@@ -23341,7 +23379,7 @@
     </w:p>
     <w:p>
       <w:r>
-        <w:t>Version 1.7 — October 2026 (updated from Version 1.6, October 2026, Version 1.5, October 2026, Version 1.4, October 2026, Version 1.3, October 2026, Version 1.2, October 2026, and Version 1.0, September 2026; see section 1.5 for what changed).</w:t>
+        <w:t>Version 1.8 — October 2026 (updated from Version 1.7, October 2026, Version 1.6, October 2026, Version 1.5, October 2026, Version 1.4, October 2026, Version 1.3, October 2026, Version 1.2, October 2026, and Version 1.0, September 2026; see section 1.5 for what changed).</w:t>
       </w:r>
     </w:p>
     <w:sectPr>

</xml_diff>

<commit_message>
help(ibs): Manual 1.9, receipt details per branch and branch admins read-only
Rebuilt from the app's docs/IBS_User_Manual.docx (app PR #69). Settings
now has a Receipts section, branches print their own name, address and
phone, and branch-level admins see company settings, roles and branches
read-only. Only the IBS pages and the hub's version line change; the
Haulage manuals are left as published.
</commit_message>
<xml_diff>
--- a/help/ibs/IBS_User_Manual.docx
+++ b/help/ibs/IBS_User_Manual.docx
@@ -40,7 +40,7 @@
         <w:rPr>
           <w:color w:val="333333"/>
         </w:rPr>
-        <w:t>Version 1.8  |  October 2026</w:t>
+        <w:t>Version 1.9  |  October 2026</w:t>
       </w:r>
     </w:p>
     <w:p>
@@ -4411,6 +4411,15 @@
       </w:pPr>
       <w:r>
         <w:rPr/>
+        <w:t>Receipt details per branch (new in version 1.9) — the business name, address, and phone printed on receipts are now set in Settings → Receipts, and with more than one branch each branch can print its own. A branch-level admin sees the company's settings, roles, and branches without changing them, and changes their own branch's receipt details. See sections 21.3 and 21.5.</w:t>
+      </w:r>
+    </w:p>
+    <w:p>
+      <w:pPr>
+        <w:pStyle w:val="ListBullet"/>
+      </w:pPr>
+      <w:r>
+        <w:rPr/>
         <w:t>The POS shows which branch you're selling from (multi-branch, new in version 1.8) — a “🏢 Selling from” label under the POS heading names the branch each sale is recorded at, and turns amber while a company-wide user is viewing 🌐 All branches. See sections 2.3 and 3.1.</w:t>
       </w:r>
     </w:p>
@@ -5287,6 +5296,14 @@
     </w:p>
     <w:p>
       <w:pPr>
+        <w:pStyle w:val="ListBullet"/>
+      </w:pPr>
+      <w:r>
+        <w:t>Settings, roles, and adding or switching off branches apply to every branch, so only company-wide admins change them. A branch-level admin sees them greyed out, and changes only their own branch's receipt details (section 21.5).</w:t>
+      </w:r>
+    </w:p>
+    <w:p>
+      <w:pPr>
         <w:pStyle w:val="Heading2"/>
       </w:pPr>
       <w:bookmarkStart w:id="11" w:name="_Toc243479211"/>
@@ -15467,7 +15484,7 @@
         </w:numPr>
       </w:pPr>
       <w:r>
-        <w:t>If your business has multiple branches, choose the user's Branch (one only) and their Visibility: Branch-level (the default — sees only that branch) or Company-wide (sees every branch; only a company-wide admin can grant this).</w:t>
+        <w:t>If your business has multiple branches, choose the user's Branch (one only) and their Visibility: Branch-level (the default — sees only that branch) or Company-wide (sees every branch; only a company-wide admin can grant this). Make anyone who should change Settings, roles, or branches Company-wide (section 21.5).</w:t>
       </w:r>
     </w:p>
     <w:p>
@@ -15624,7 +15641,7 @@
               <w:t xml:space="preserve">Who can do this:  </w:t>
             </w:r>
             <w:r>
-              <w:t>Requires roles.manage, and custom roles: included in Enterprise, an add-on on Growth, and not available on Core.</w:t>
+              <w:t>Requires roles.manage, and custom roles: included in Enterprise, an add-on on Growth, and not available on Core. With more than one branch, only company-wide users can add, change, or delete a role; a branch-level user can open the roles to look.</w:t>
             </w:r>
           </w:p>
         </w:tc>
@@ -16610,7 +16627,7 @@
               <w:t xml:space="preserve">Who can do this:  </w:t>
             </w:r>
             <w:r>
-              <w:t>Requires branches.manage. Core and Growth include one branch, and more can be added as an add-on; Enterprise has no limit.</w:t>
+              <w:t>Requires branches.manage. Core and Growth include one branch, and more can be added as an add-on; Enterprise has no limit. Only company-wide users can add a branch or switch one on or off; a branch-level admin can open and edit only their own branch.</w:t>
             </w:r>
           </w:p>
         </w:tc>
@@ -16640,7 +16657,7 @@
         </w:numPr>
       </w:pPr>
       <w:r>
-        <w:t>Enter the Branch Name and, optionally, Address and Phone.</w:t>
+        <w:t>Enter the Branch Name and, optionally, its Name on Receipts, Address, and Phone. They print at the top of the branch's receipts, goods-received notes, and proformas; any left blank print the business's (section 21.5).</w:t>
       </w:r>
     </w:p>
     <w:p>
@@ -16849,7 +16866,7 @@
               <w:t xml:space="preserve">Who can do this:  </w:t>
             </w:r>
             <w:r>
-              <w:t>Requires settings.manage.</w:t>
+              <w:t>Requires settings.manage. With more than one branch, only company-wide users change the settings. A branch-level admin sees them greyed out, and changes only their own branch's details in the Receipts section, saved with “Save receipt details.”</w:t>
             </w:r>
           </w:p>
         </w:tc>
@@ -16858,9 +16875,7 @@
     <w:p/>
     <w:p>
       <w:r>
-        <w:t xml:space="preserve">Administration → Settings groups its options into four sections — General, Point of sale, Tax, and Optional features — listed down the left of the page (across the top on a phone); click one to jump to it. Each on/off option is a switch with a one-line explanation under it; click “How this works” for the full explanation. Options that depend on another, such as the tax rate and the </w:t>
-        <w:lastRenderedPageBreak/>
-        <w:t>expiry options, only appear while it is switched on. Change what you need, then click “Save settings” — the button stays at the bottom of the screen as you scroll.</w:t>
+        <w:t>Administration → Settings groups its options into five sections — General, Receipts, Point of sale, Tax, and Optional features — listed down the left of the page (across the top on a phone); click one to jump to it. Each on/off option is a switch with a one-line explanation under it; click “How this works” for the full explanation. Options that depend on another, such as the tax rate and the expiry options, only appear while it is switched on. Change what you need, then click “Save settings” — the button stays at the bottom of the screen as you scroll.</w:t>
       </w:r>
     </w:p>
     <w:tbl>
@@ -16964,6 +16979,68 @@
             </w:pPr>
             <w:r>
               <w:t>What “now” means everywhere — sale and purchase timestamps, reports, exports. Pick where the business operates; the local time is shown under it. Takes effect for everyone from their next page load.</w:t>
+            </w:r>
+          </w:p>
+        </w:tc>
+      </w:tr>
+      <w:tr>
+        <w:trPr>
+          <w:cnfStyle w:val="000000010000" w:firstRow="0" w:lastRow="0" w:firstColumn="0" w:lastColumn="0" w:oddVBand="0" w:evenVBand="0" w:oddHBand="0" w:evenHBand="1" w:firstRowFirstColumn="0" w:firstRowLastColumn="0" w:lastRowFirstColumn="0" w:lastRowLastColumn="0"/>
+          <w:cantSplit/>
+          <w:jc w:val="center"/>
+        </w:trPr>
+        <w:tc>
+          <w:tcPr>
+            <w:cnfStyle w:val="001000000000" w:firstRow="0" w:lastRow="0" w:firstColumn="1" w:lastColumn="0" w:oddVBand="0" w:evenVBand="0" w:oddHBand="0" w:evenHBand="0" w:firstRowFirstColumn="0" w:firstRowLastColumn="0" w:lastRowFirstColumn="0" w:lastRowLastColumn="0"/>
+            <w:tcW w:w="4320" w:type="dxa"/>
+          </w:tcPr>
+          <w:p>
+            <w:r>
+              <w:t>Receipts → Business details</w:t>
+            </w:r>
+          </w:p>
+        </w:tc>
+        <w:tc>
+          <w:tcPr>
+            <w:tcW w:w="4320" w:type="dxa"/>
+          </w:tcPr>
+          <w:p>
+            <w:pPr>
+              <w:cnfStyle w:val="000000010000" w:firstRow="0" w:lastRow="0" w:firstColumn="0" w:lastColumn="0" w:oddVBand="0" w:evenVBand="0" w:oddHBand="0" w:evenHBand="1" w:firstRowFirstColumn="0" w:firstRowLastColumn="0" w:lastRowFirstColumn="0" w:lastRowLastColumn="0"/>
+            </w:pPr>
+            <w:r>
+              <w:t>The business name, address, and phone printed at the top of receipts, goods-received notes, proformas, and customer statements. The name is required. A phone can hold two numbers, e.g. “024 123 4567 / 020 765 4321”. With more than one branch, only a company-wide admin changes these.</w:t>
+            </w:r>
+          </w:p>
+        </w:tc>
+      </w:tr>
+      <w:tr>
+        <w:trPr>
+          <w:cnfStyle w:val="000000010000" w:firstRow="0" w:lastRow="0" w:firstColumn="0" w:lastColumn="0" w:oddVBand="0" w:evenVBand="0" w:oddHBand="0" w:evenHBand="1" w:firstRowFirstColumn="0" w:firstRowLastColumn="0" w:lastRowFirstColumn="0" w:lastRowLastColumn="0"/>
+          <w:cantSplit/>
+          <w:jc w:val="center"/>
+        </w:trPr>
+        <w:tc>
+          <w:tcPr>
+            <w:cnfStyle w:val="001000000000" w:firstRow="0" w:lastRow="0" w:firstColumn="1" w:lastColumn="0" w:oddVBand="0" w:evenVBand="0" w:oddHBand="0" w:evenHBand="0" w:firstRowFirstColumn="0" w:firstRowLastColumn="0" w:lastRowFirstColumn="0" w:lastRowLastColumn="0"/>
+            <w:tcW w:w="4320" w:type="dxa"/>
+          </w:tcPr>
+          <w:p>
+            <w:r>
+              <w:t>Receipts → each branch (multi-branch only)</w:t>
+            </w:r>
+          </w:p>
+        </w:tc>
+        <w:tc>
+          <w:tcPr>
+            <w:tcW w:w="4320" w:type="dxa"/>
+          </w:tcPr>
+          <w:p>
+            <w:pPr>
+              <w:cnfStyle w:val="000000010000" w:firstRow="0" w:lastRow="0" w:firstColumn="0" w:lastColumn="0" w:oddVBand="0" w:evenVBand="0" w:oddHBand="0" w:evenHBand="1" w:firstRowFirstColumn="0" w:firstRowLastColumn="0" w:lastRowFirstColumn="0" w:lastRowLastColumn="0"/>
+            </w:pPr>
+            <w:r>
+              <w:t>A branch's Name on Receipts, Phone, and Address, printed on that branch's receipts, goods-received notes, and proformas. Leave any blank to print the business's. Customer statements always show the business's details. A company-wide admin sees every branch here; a branch-level admin only their own.</w:t>
             </w:r>
           </w:p>
         </w:tc>
@@ -19475,6 +19552,40 @@
     </w:p>
     <w:p>
       <w:pPr>
+        <w:pStyle w:val="Heading3"/>
+      </w:pPr>
+      <w:r>
+        <w:rPr>
+          <w:color w:val="1D4E89"/>
+        </w:rPr>
+        <w:t>How do I change the business name or phone on our receipts?</w:t>
+      </w:r>
+    </w:p>
+    <w:p>
+      <w:r>
+        <w:rPr/>
+        <w:t>Settings → Receipts (section 21.5). With more than one branch, each branch can print its own name, address, and phone there, or on its page under Administration → Branches; a branch-level admin can change only their own branch's.</w:t>
+      </w:r>
+    </w:p>
+    <w:p>
+      <w:pPr>
+        <w:pStyle w:val="Heading3"/>
+      </w:pPr>
+      <w:r>
+        <w:rPr>
+          <w:color w:val="1D4E89"/>
+        </w:rPr>
+        <w:t>Everything in Settings is greyed out.</w:t>
+      </w:r>
+    </w:p>
+    <w:p>
+      <w:r>
+        <w:rPr/>
+        <w:t>You're a branch-level admin at a business with more than one branch. Settings apply to every branch, so only a company-wide admin can change them; you can still change your own branch's receipt details under Receipts. If you need more, ask an administrator to make you Company-wide (section 21.1).</w:t>
+      </w:r>
+    </w:p>
+    <w:p>
+      <w:pPr>
         <w:pStyle w:val="Heading1"/>
       </w:pPr>
       <w:bookmarkStart w:id="109" w:name="_Toc243479305"/>
@@ -19493,7 +19604,7 @@
     </w:p>
     <w:p>
       <w:r>
-        <w:t>Version 1.8 — October 2026 (updated from Version 1.7, October 2026, Version 1.6, October 2026, Version 1.5, October 2026, Version 1.4, October 2026, Version 1.3, October 2026, Version 1.2, October 2026, and Version 1.0, September 2026; see section 1.5 for what changed).</w:t>
+        <w:t>Version 1.9 — October 2026 (updated from Version 1.8, October 2026, Version 1.7, October 2026, Version 1.6, October 2026, Version 1.5, October 2026, Version 1.4, October 2026, Version 1.3, October 2026, Version 1.2, October 2026, and Version 1.0, September 2026; see section 1.5 for what changed).</w:t>
       </w:r>
     </w:p>
     <w:sectPr>

</xml_diff>

<commit_message>
help(ibs): Manual 1.10, Daily Cash Report and counting the cash
Rebuilt from the app's docs/IBS_User_Manual.docx (app PR #72). New
sections 15.5 Counting the cash and 19.5 Daily Cash Report, with the
reports, settings and permission tables, What's new and FAQs updated.
Only the IBS pages and the hub's version line change; the Haulage
manuals are left as published.
</commit_message>
<xml_diff>
--- a/help/ibs/IBS_User_Manual.docx
+++ b/help/ibs/IBS_User_Manual.docx
@@ -40,7 +40,7 @@
         <w:rPr>
           <w:color w:val="333333"/>
         </w:rPr>
-        <w:t>Version 1.9  |  October 2026</w:t>
+        <w:t>Version 1.10  |  October 2026</w:t>
       </w:r>
     </w:p>
     <w:p>
@@ -4411,6 +4411,24 @@
       </w:pPr>
       <w:r>
         <w:rPr/>
+        <w:t>Daily Cash Report (new in version 1.10) — follow the cash in a branch's drawer day by day: what came in, what was sent to the bank or mobile money, and what's carried forward to the next day. See section 19.5.</w:t>
+      </w:r>
+    </w:p>
+    <w:p>
+      <w:pPr>
+        <w:pStyle w:val="ListBullet"/>
+      </w:pPr>
+      <w:r>
+        <w:rPr/>
+        <w:t>Counting the cash (new in version 1.10) — count the drawer at closing; any shortage or overage is recorded, and cashiers count without seeing what the drawer should hold. See section 15.5.</w:t>
+      </w:r>
+    </w:p>
+    <w:p>
+      <w:pPr>
+        <w:pStyle w:val="ListBullet"/>
+      </w:pPr>
+      <w:r>
+        <w:rPr/>
         <w:t>Receipt details per branch (new in version 1.9) — the business name, address, and phone printed on receipts are now set in Settings → Receipts, and with more than one branch each branch can print its own. A branch-level admin sees the company's settings, roles, and branches without changing them, and changes their own branch's receipt details. See sections 21.3 and 21.5.</w:t>
       </w:r>
     </w:p>
@@ -13384,6 +13402,222 @@
     </w:tbl>
     <w:p>
       <w:pPr>
+        <w:pStyle w:val="Heading2"/>
+      </w:pPr>
+      <w:r>
+        <w:rPr>
+          <w:color w:val="1D4E89"/>
+        </w:rPr>
+        <w:t>15.5 Counting the cash</w:t>
+      </w:r>
+    </w:p>
+    <w:tbl>
+      <w:tblPr>
+        <w:tblW w:w="0" w:type="auto"/>
+        <w:tblBorders>
+          <w:top w:val="nil"/>
+          <w:left w:val="nil"/>
+          <w:bottom w:val="nil"/>
+          <w:right w:val="nil"/>
+          <w:insideH w:val="nil"/>
+          <w:insideV w:val="nil"/>
+        </w:tblBorders>
+        <w:tblLook w:val="04A0" w:firstRow="1" w:lastRow="0" w:firstColumn="1" w:lastColumn="0" w:noHBand="0" w:noVBand="1"/>
+      </w:tblPr>
+      <w:tblGrid>
+        <w:gridCol w:w="8640"/>
+      </w:tblGrid>
+      <w:tr>
+        <w:trPr>
+          <w:cantSplit/>
+        </w:trPr>
+        <w:tc>
+          <w:tcPr>
+            <w:tcW w:w="8640" w:type="dxa"/>
+            <w:shd w:val="clear" w:color="auto" w:fill="F2F2F2"/>
+          </w:tcPr>
+          <w:p>
+            <w:r>
+              <w:rPr>
+                <w:b/>
+              </w:rPr>
+              <w:t xml:space="preserve">Who can do this:  </w:t>
+            </w:r>
+            <w:r>
+              <w:t>Requires Count Cash (cash.count), which the Admin and Staff roles have. On Core, and on Growth without the Custom Roles add-on, cashiers can count too while Settings → Point of sale → “Cashiers can count the cash” is on (section 21.5); with custom roles, give the permission to any role (section 21.2). Available on every plan.</w:t>
+            </w:r>
+          </w:p>
+        </w:tc>
+      </w:tr>
+    </w:tbl>
+    <w:p>
+      <w:r>
+        <w:fldChar w:fldCharType="end"/>
+      </w:r>
+    </w:p>
+    <w:p>
+      <w:r>
+        <w:t>At closing, count the cash in your branch's drawer and enter the total. The system compares it with what the drawer should hold at that moment, the branch's Cash account balance, and records any shortage or overage. Admin and Staff find it under Finance → 💵 Count Cash; cashiers next to 🛒 POS at the top of the screen. It's also on the Daily Cash Report (section 19.5).</w:t>
+      </w:r>
+    </w:p>
+    <w:p>
+      <w:pPr>
+        <w:pStyle w:val="Heading3"/>
+      </w:pPr>
+      <w:r>
+        <w:rPr>
+          <w:color w:val="1D4E89"/>
+        </w:rPr>
+        <w:t>Counting the drawer</w:t>
+      </w:r>
+    </w:p>
+    <w:p>
+      <w:pPr>
+        <w:pStyle w:val="ListNumber"/>
+        <w:keepNext/>
+        <w:numPr>
+          <w:ilvl w:val="0"/>
+          <w:numId w:val="52"/>
+        </w:numPr>
+      </w:pPr>
+      <w:r>
+        <w:t>Open 💵 Count Cash. If you can count more than one branch's drawer, choose the Cash drawer.</w:t>
+      </w:r>
+    </w:p>
+    <w:p>
+      <w:pPr>
+        <w:pStyle w:val="ListNumber"/>
+        <w:keepNext/>
+        <w:numPr>
+          <w:ilvl w:val="0"/>
+          <w:numId w:val="52"/>
+        </w:numPr>
+      </w:pPr>
+      <w:r>
+        <w:t>Count every note and coin in the drawer, and enter the total in Cash counted.</w:t>
+      </w:r>
+    </w:p>
+    <w:p>
+      <w:pPr>
+        <w:pStyle w:val="ListNumber"/>
+        <w:keepNext/>
+        <w:numPr>
+          <w:ilvl w:val="0"/>
+          <w:numId w:val="52"/>
+        </w:numPr>
+      </w:pPr>
+      <w:r>
+        <w:t>Add a Note if you need to, for example the reason for a shortage.</w:t>
+      </w:r>
+    </w:p>
+    <w:p>
+      <w:pPr>
+        <w:pStyle w:val="ListNumber"/>
+        <w:keepNext/>
+        <w:numPr>
+          <w:ilvl w:val="0"/>
+          <w:numId w:val="52"/>
+        </w:numPr>
+      </w:pPr>
+      <w:r>
+        <w:t>Click “Save count” and confirm.</w:t>
+      </w:r>
+    </w:p>
+    <w:p>
+      <w:pPr>
+        <w:pStyle w:val="Heading3"/>
+      </w:pPr>
+      <w:r>
+        <w:rPr>
+          <w:color w:val="1D4E89"/>
+        </w:rPr>
+        <w:t>Shortages and overages</w:t>
+      </w:r>
+    </w:p>
+    <w:p>
+      <w:r>
+        <w:t>If the count differs from what the drawer should hold, the difference is recorded on the Cash account as “Cash short at count” or “Cash over at count.” The account then matches the cash really in the drawer, so the next count only checks what happened since. Shortages and overages show in the Daily Cash Report and the account's ledger, and every count is in the Audit Log.</w:t>
+      </w:r>
+    </w:p>
+    <w:tbl>
+      <w:tblPr>
+        <w:tblW w:w="0" w:type="auto"/>
+        <w:tblBorders>
+          <w:top w:val="nil"/>
+          <w:left w:val="nil"/>
+          <w:bottom w:val="nil"/>
+          <w:right w:val="nil"/>
+          <w:insideH w:val="nil"/>
+          <w:insideV w:val="nil"/>
+        </w:tblBorders>
+        <w:tblLook w:val="04A0" w:firstRow="1" w:lastRow="0" w:firstColumn="1" w:lastColumn="0" w:noHBand="0" w:noVBand="1"/>
+      </w:tblPr>
+      <w:tblGrid>
+        <w:gridCol w:w="8640"/>
+      </w:tblGrid>
+      <w:tr>
+        <w:trPr>
+          <w:cantSplit/>
+        </w:trPr>
+        <w:tc>
+          <w:tcPr>
+            <w:tcW w:w="8640" w:type="dxa"/>
+            <w:shd w:val="clear" w:color="auto" w:fill="EAF1FB"/>
+          </w:tcPr>
+          <w:p>
+            <w:r>
+              <w:rPr>
+                <w:b/>
+              </w:rPr>
+              <w:lastRenderedPageBreak/>
+              <w:t xml:space="preserve">Note:  </w:t>
+            </w:r>
+            <w:r>
+              <w:t>A count can't be changed or deleted. If you counted wrong, count again: the new count puts the difference right.</w:t>
+            </w:r>
+          </w:p>
+        </w:tc>
+      </w:tr>
+    </w:tbl>
+    <w:p>
+      <w:r>
+        <w:fldChar w:fldCharType="end"/>
+      </w:r>
+    </w:p>
+    <w:p>
+      <w:pPr>
+        <w:pStyle w:val="Heading3"/>
+      </w:pPr>
+      <w:r>
+        <w:rPr>
+          <w:color w:val="1D4E89"/>
+        </w:rPr>
+        <w:t>Sales after the count</w:t>
+      </w:r>
+    </w:p>
+    <w:p>
+      <w:r>
+        <w:t>A count checks the drawer at the moment it's saved. If a customer buys something afterwards, sell as usual: the cash goes into the drawer and into the cash carried forward to the next day, and the next count checks it. The Daily Cash Report shows how much came in after the last count.</w:t>
+      </w:r>
+    </w:p>
+    <w:p>
+      <w:pPr>
+        <w:pStyle w:val="Heading3"/>
+      </w:pPr>
+      <w:r>
+        <w:rPr>
+          <w:color w:val="1D4E89"/>
+        </w:rPr>
+        <w:t>Counting blind</w:t>
+      </w:r>
+    </w:p>
+    <w:p>
+      <w:r>
+        <w:t>Anyone who can't open Financial Accounts, such as a cashier, counts blind: they don't see what the drawer should hold, before or after counting, or the difference. After saving they see “Count saved. Thank you.” Anyone who can open Financial Accounts sees the result in the Daily Cash Report. Counting blind is the usual practice: the count is what's really in the drawer, not a number made to match.</w:t>
+      </w:r>
+    </w:p>
+    <w:p>
+      <w:pPr>
         <w:pStyle w:val="Heading1"/>
         <w:pageBreakBefore/>
       </w:pPr>
@@ -14175,6 +14409,37 @@
           </w:p>
         </w:tc>
       </w:tr>
+      <w:tr>
+        <w:trPr>
+          <w:cnfStyle w:val="000000010000" w:firstRow="0" w:lastRow="0" w:firstColumn="0" w:lastColumn="0" w:oddVBand="0" w:evenVBand="0" w:oddHBand="0" w:evenHBand="1" w:firstRowFirstColumn="0" w:firstRowLastColumn="0" w:lastRowFirstColumn="0" w:lastRowLastColumn="0"/>
+          <w:cantSplit/>
+          <w:jc w:val="center"/>
+        </w:trPr>
+        <w:tc>
+          <w:tcPr>
+            <w:cnfStyle w:val="001000000000" w:firstRow="0" w:lastRow="0" w:firstColumn="1" w:lastColumn="0" w:oddVBand="0" w:evenVBand="0" w:oddHBand="0" w:evenHBand="0" w:firstRowFirstColumn="0" w:firstRowLastColumn="0" w:lastRowFirstColumn="0" w:lastRowLastColumn="0"/>
+            <w:tcW w:w="4320" w:type="dxa"/>
+          </w:tcPr>
+          <w:p>
+            <w:r>
+              <w:t>Daily Cash</w:t>
+            </w:r>
+          </w:p>
+        </w:tc>
+        <w:tc>
+          <w:tcPr>
+            <w:tcW w:w="4320" w:type="dxa"/>
+          </w:tcPr>
+          <w:p>
+            <w:pPr>
+              <w:cnfStyle w:val="000000010000" w:firstRow="0" w:lastRow="0" w:firstColumn="0" w:lastColumn="0" w:oddVBand="0" w:evenVBand="0" w:oddHBand="0" w:evenHBand="1" w:firstRowFirstColumn="0" w:firstRowLastColumn="0" w:lastRowFirstColumn="0" w:lastRowLastColumn="0"/>
+            </w:pPr>
+            <w:r>
+              <w:t>Only with Access Financial Accounts. One cash drawer, day by day: cash brought forward, money in and out, money sent to the bank and mobile money, cash counts, and what's carried forward. See section 19.5.</w:t>
+            </w:r>
+          </w:p>
+        </w:tc>
+      </w:tr>
     </w:tbl>
     <w:p/>
     <w:p>
@@ -14828,6 +15093,203 @@
     <w:p/>
     <w:p>
       <w:pPr>
+        <w:pStyle w:val="Heading2"/>
+      </w:pPr>
+      <w:r>
+        <w:rPr>
+          <w:color w:val="1D4E89"/>
+        </w:rPr>
+        <w:t>19.5 Daily Cash Report</w:t>
+      </w:r>
+    </w:p>
+    <w:tbl>
+      <w:tblPr>
+        <w:tblW w:w="0" w:type="auto"/>
+        <w:tblBorders>
+          <w:top w:val="nil"/>
+          <w:left w:val="nil"/>
+          <w:bottom w:val="nil"/>
+          <w:right w:val="nil"/>
+          <w:insideH w:val="nil"/>
+          <w:insideV w:val="nil"/>
+        </w:tblBorders>
+        <w:tblLook w:val="04A0" w:firstRow="1" w:lastRow="0" w:firstColumn="1" w:lastColumn="0" w:noHBand="0" w:noVBand="1"/>
+      </w:tblPr>
+      <w:tblGrid>
+        <w:gridCol w:w="8640"/>
+      </w:tblGrid>
+      <w:tr>
+        <w:trPr>
+          <w:cantSplit/>
+        </w:trPr>
+        <w:tc>
+          <w:tcPr>
+            <w:tcW w:w="8640" w:type="dxa"/>
+            <w:shd w:val="clear" w:color="auto" w:fill="F2F2F2"/>
+          </w:tcPr>
+          <w:p>
+            <w:r>
+              <w:rPr>
+                <w:b/>
+              </w:rPr>
+              <w:t xml:space="preserve">Who can do this:  </w:t>
+            </w:r>
+            <w:r>
+              <w:t>Requires financial_accounts.access, because it shows cash balances. Available on every plan. A branch-level user sees only their own branch's cash accounts.</w:t>
+            </w:r>
+          </w:p>
+        </w:tc>
+      </w:tr>
+    </w:tbl>
+    <w:p>
+      <w:r>
+        <w:fldChar w:fldCharType="end"/>
+      </w:r>
+    </w:p>
+    <w:p>
+      <w:r>
+        <w:t>Reports → 💵 Daily Cash follows the cash in one drawer, a branch's Cash account, day by day. Choose the Cash account and a Period; it opens on today, for your branch.</w:t>
+      </w:r>
+    </w:p>
+    <w:p>
+      <w:pPr>
+        <w:pStyle w:val="Heading3"/>
+      </w:pPr>
+      <w:r>
+        <w:rPr>
+          <w:color w:val="1D4E89"/>
+        </w:rPr>
+        <w:t>One day</w:t>
+      </w:r>
+    </w:p>
+    <w:p>
+      <w:pPr>
+        <w:pStyle w:val="ListBullet"/>
+      </w:pPr>
+      <w:r>
+        <w:rPr>
+          <w:b/>
+        </w:rPr>
+        <w:t>Cash: brought forward from the day before; money in (cash sales, payments on earlier sales and opening debts, customer deposits, money received from other accounts, cash over at a count); money out (refunds, expenses, payments to suppliers, sent to bank, sent to mobile money, transfer charges, cash short at a count); and carried forward, what should be left in the drawer at the end of the day (“Cash at hand now” for today).</w:t>
+      </w:r>
+    </w:p>
+    <w:p>
+      <w:pPr>
+        <w:pStyle w:val="ListBullet"/>
+      </w:pPr>
+      <w:r>
+        <w:rPr>
+          <w:b/>
+        </w:rPr>
+        <w:t>Sales: the branch's sales for the day by how they were paid (cash, mobile money, bank, customer deposit, credit), and what's still owing on them.</w:t>
+      </w:r>
+    </w:p>
+    <w:p>
+      <w:pPr>
+        <w:pStyle w:val="ListBullet"/>
+      </w:pPr>
+      <w:r>
+        <w:rPr>
+          <w:b/>
+        </w:rPr>
+        <w:t>Cash counts: each count, with who counted, what should have been in the drawer, what was counted, and whether it was short, over, or matched (section 15.5). A line says how much came in or went out after the last count.</w:t>
+      </w:r>
+    </w:p>
+    <w:p>
+      <w:pPr>
+        <w:pStyle w:val="ListBullet"/>
+      </w:pPr>
+      <w:r>
+        <w:rPr>
+          <w:b/>
+        </w:rPr>
+        <w:t>Money moved: each transfer to or from the drawer, with its time, the other account, and who made it.</w:t>
+      </w:r>
+    </w:p>
+    <w:p>
+      <w:r>
+        <w:t>Cash sales is the cash taken at the till on the day of the sale. Money taken later for a sale made on an earlier day is a payment on an earlier sale.</w:t>
+      </w:r>
+    </w:p>
+    <w:p>
+      <w:pPr>
+        <w:pStyle w:val="Heading3"/>
+      </w:pPr>
+      <w:r>
+        <w:rPr>
+          <w:color w:val="1D4E89"/>
+        </w:rPr>
+        <w:t>Several days</w:t>
+      </w:r>
+    </w:p>
+    <w:p>
+      <w:r>
+        <w:t>For a longer period there's a row per day: sales, brought forward, money in, sent to bank, sent to mobile money, other money out, short or over at count (“Not counted” on days without one), and carried forward. Each day's carried forward is the next day's brought forward. Click a day to see it in full. A period can be up to 92 days.</w:t>
+      </w:r>
+    </w:p>
+    <w:p>
+      <w:pPr>
+        <w:pStyle w:val="Heading3"/>
+      </w:pPr>
+      <w:r>
+        <w:rPr>
+          <w:color w:val="1D4E89"/>
+        </w:rPr>
+        <w:t>Changed since counted</w:t>
+      </w:r>
+    </w:p>
+    <w:p>
+      <w:r>
+        <w:t>A count is marked “Changed since counted” when something was recorded afterwards under a time before the count, an import of past sales, say. That changes what the drawer should have held when it was counted, so check that count again.</w:t>
+      </w:r>
+    </w:p>
+    <w:tbl>
+      <w:tblPr>
+        <w:tblW w:w="0" w:type="auto"/>
+        <w:tblBorders>
+          <w:top w:val="nil"/>
+          <w:left w:val="nil"/>
+          <w:bottom w:val="nil"/>
+          <w:right w:val="nil"/>
+          <w:insideH w:val="nil"/>
+          <w:insideV w:val="nil"/>
+        </w:tblBorders>
+        <w:tblLook w:val="04A0" w:firstRow="1" w:lastRow="0" w:firstColumn="1" w:lastColumn="0" w:noHBand="0" w:noVBand="1"/>
+      </w:tblPr>
+      <w:tblGrid>
+        <w:gridCol w:w="8640"/>
+      </w:tblGrid>
+      <w:tr>
+        <w:trPr>
+          <w:cantSplit/>
+        </w:trPr>
+        <w:tc>
+          <w:tcPr>
+            <w:tcW w:w="8640" w:type="dxa"/>
+            <w:shd w:val="clear" w:color="auto" w:fill="EAF1FB"/>
+          </w:tcPr>
+          <w:p>
+            <w:r>
+              <w:rPr>
+                <w:b/>
+              </w:rPr>
+              <w:lastRenderedPageBreak/>
+              <w:t xml:space="preserve">Note:  </w:t>
+            </w:r>
+            <w:r>
+              <w:t>The report needs every deposit of cash to the bank or mobile money recorded as a transfer (Finance → Financial Accounts → 🔄 Move Funds, section 15.3). Cash sent but not recorded stays in the drawer's carried forward.</w:t>
+            </w:r>
+          </w:p>
+        </w:tc>
+      </w:tr>
+    </w:tbl>
+    <w:p>
+      <w:r>
+        <w:fldChar w:fldCharType="end"/>
+      </w:r>
+    </w:p>
+    <w:p>
+      <w:pPr>
         <w:pStyle w:val="Heading1"/>
         <w:pageBreakBefore/>
       </w:pPr>
@@ -15836,7 +16298,7 @@
               <w:cnfStyle w:val="000000100000" w:firstRow="0" w:lastRow="0" w:firstColumn="0" w:lastColumn="0" w:oddVBand="0" w:evenVBand="0" w:oddHBand="1" w:evenHBand="0" w:firstRowFirstColumn="0" w:firstRowLastColumn="0" w:lastRowFirstColumn="0" w:lastRowLastColumn="0"/>
             </w:pPr>
             <w:r>
-              <w:t>POS and Sales (Access Sales / POS) only — none of the management permissions</w:t>
+              <w:t>POS and Sales (Access Sales / POS) — none of the management permissions. On Core and Growth, also Count Cash while Settings → “Cashiers can count the cash” is on.</w:t>
             </w:r>
           </w:p>
         </w:tc>
@@ -16488,6 +16950,37 @@
       </w:tr>
       <w:tr>
         <w:trPr>
+          <w:cnfStyle w:val="000000100000" w:firstRow="0" w:lastRow="0" w:firstColumn="0" w:lastColumn="0" w:oddVBand="0" w:evenVBand="0" w:oddHBand="1" w:evenHBand="0" w:firstRowFirstColumn="0" w:firstRowLastColumn="0" w:lastRowFirstColumn="0" w:lastRowLastColumn="0"/>
+          <w:cantSplit/>
+          <w:jc w:val="center"/>
+        </w:trPr>
+        <w:tc>
+          <w:tcPr>
+            <w:cnfStyle w:val="001000000000" w:firstRow="0" w:lastRow="0" w:firstColumn="1" w:lastColumn="0" w:oddVBand="0" w:evenVBand="0" w:oddHBand="0" w:evenHBand="0" w:firstRowFirstColumn="0" w:firstRowLastColumn="0" w:lastRowFirstColumn="0" w:lastRowLastColumn="0"/>
+            <w:tcW w:w="4320" w:type="dxa"/>
+          </w:tcPr>
+          <w:p>
+            <w:r>
+              <w:t>cash.count</w:t>
+            </w:r>
+          </w:p>
+        </w:tc>
+        <w:tc>
+          <w:tcPr>
+            <w:tcW w:w="4320" w:type="dxa"/>
+          </w:tcPr>
+          <w:p>
+            <w:pPr>
+              <w:cnfStyle w:val="000000100000" w:firstRow="0" w:lastRow="0" w:firstColumn="0" w:lastColumn="0" w:oddVBand="0" w:evenVBand="0" w:oddHBand="1" w:evenHBand="0" w:firstRowFirstColumn="0" w:firstRowLastColumn="0" w:lastRowFirstColumn="0" w:lastRowLastColumn="0"/>
+            </w:pPr>
+            <w:r>
+              <w:t>Count Cash: count a drawer at closing (section 15.5)</w:t>
+            </w:r>
+          </w:p>
+        </w:tc>
+      </w:tr>
+      <w:tr>
+        <w:trPr>
           <w:cnfStyle w:val="000000010000" w:firstRow="0" w:lastRow="0" w:firstColumn="0" w:lastColumn="0" w:oddVBand="0" w:evenVBand="0" w:oddHBand="0" w:evenHBand="1" w:firstRowFirstColumn="0" w:firstRowLastColumn="0" w:lastRowFirstColumn="0" w:lastRowLastColumn="0"/>
           <w:cantSplit/>
           <w:jc w:val="center"/>
@@ -17134,6 +17627,37 @@
             </w:pPr>
             <w:r>
               <w:t>Switch off to hide account balances wherever staff choose an account (POS, purchases, expenses, deposits); only roles with Financial Accounts access keep seeing them.</w:t>
+            </w:r>
+          </w:p>
+        </w:tc>
+      </w:tr>
+      <w:tr>
+        <w:trPr>
+          <w:cnfStyle w:val="000000100000" w:firstRow="0" w:lastRow="0" w:firstColumn="0" w:lastColumn="0" w:oddVBand="0" w:evenVBand="0" w:oddHBand="1" w:evenHBand="0" w:firstRowFirstColumn="0" w:firstRowLastColumn="0" w:lastRowFirstColumn="0" w:lastRowLastColumn="0"/>
+          <w:cantSplit/>
+          <w:jc w:val="center"/>
+        </w:trPr>
+        <w:tc>
+          <w:tcPr>
+            <w:cnfStyle w:val="001000000000" w:firstRow="0" w:lastRow="0" w:firstColumn="1" w:lastColumn="0" w:oddVBand="0" w:evenVBand="0" w:oddHBand="0" w:evenHBand="0" w:firstRowFirstColumn="0" w:firstRowLastColumn="0" w:lastRowFirstColumn="0" w:lastRowLastColumn="0"/>
+            <w:tcW w:w="4320" w:type="dxa"/>
+          </w:tcPr>
+          <w:p>
+            <w:r>
+              <w:t>Point of sale → Cashiers can count the cash</w:t>
+            </w:r>
+          </w:p>
+        </w:tc>
+        <w:tc>
+          <w:tcPr>
+            <w:tcW w:w="4320" w:type="dxa"/>
+          </w:tcPr>
+          <w:p>
+            <w:pPr>
+              <w:cnfStyle w:val="000000100000" w:firstRow="0" w:lastRow="0" w:firstColumn="0" w:lastColumn="0" w:oddVBand="0" w:evenVBand="0" w:oddHBand="1" w:evenHBand="0" w:firstRowFirstColumn="0" w:firstRowLastColumn="0" w:lastRowFirstColumn="0" w:lastRowLastColumn="0"/>
+            </w:pPr>
+            <w:r>
+              <w:t>Core, and Growth without the Custom Roles add-on. Lets cashiers count the drawer at closing; Admin and Staff always can. Cashiers count blind. See section 15.5.</w:t>
             </w:r>
           </w:p>
         </w:tc>
@@ -19586,6 +20110,57 @@
     </w:p>
     <w:p>
       <w:pPr>
+        <w:pStyle w:val="Heading3"/>
+      </w:pPr>
+      <w:r>
+        <w:rPr>
+          <w:color w:val="1D4E89"/>
+        </w:rPr>
+        <w:t>Why can't I see how much should be in the drawer when I count?</w:t>
+      </w:r>
+    </w:p>
+    <w:p>
+      <w:r>
+        <w:rPr/>
+        <w:t>You're counting blind (section 15.5): only people who can open Financial Accounts see what the drawer should hold. Count every note and coin and enter the total; an admin sees whether it matched in the Daily Cash Report.</w:t>
+      </w:r>
+    </w:p>
+    <w:p>
+      <w:pPr>
+        <w:pStyle w:val="Heading3"/>
+      </w:pPr>
+      <w:r>
+        <w:rPr>
+          <w:color w:val="1D4E89"/>
+        </w:rPr>
+        <w:t>I entered the wrong amount when counting the cash.</w:t>
+      </w:r>
+    </w:p>
+    <w:p>
+      <w:r>
+        <w:rPr/>
+        <w:t>A count can't be changed. Count again and save the right amount: the new count records the difference, so the cash account matches the drawer again.</w:t>
+      </w:r>
+    </w:p>
+    <w:p>
+      <w:pPr>
+        <w:pStyle w:val="Heading3"/>
+      </w:pPr>
+      <w:r>
+        <w:rPr>
+          <w:color w:val="1D4E89"/>
+        </w:rPr>
+        <w:t>Someone bought something after I counted the cash.</w:t>
+      </w:r>
+    </w:p>
+    <w:p>
+      <w:r>
+        <w:rPr/>
+        <w:t>Sell as usual. The cash goes into the cash carried forward to the next day, and the next count checks it (section 15.5).</w:t>
+      </w:r>
+    </w:p>
+    <w:p>
+      <w:pPr>
         <w:pStyle w:val="Heading1"/>
       </w:pPr>
       <w:bookmarkStart w:id="109" w:name="_Toc243479305"/>
@@ -19604,7 +20179,7 @@
     </w:p>
     <w:p>
       <w:r>
-        <w:t>Version 1.9 — October 2026 (updated from Version 1.8, October 2026, Version 1.7, October 2026, Version 1.6, October 2026, Version 1.5, October 2026, Version 1.4, October 2026, Version 1.3, October 2026, Version 1.2, October 2026, and Version 1.0, September 2026; see section 1.5 for what changed).</w:t>
+        <w:t>Version 1.10 — October 2026 (updated from Version 1.9, October 2026, Version 1.8, October 2026, Version 1.7, October 2026, Version 1.6, October 2026, Version 1.5, October 2026, Version 1.4, October 2026, Version 1.3, October 2026, Version 1.2, October 2026, and Version 1.0, September 2026; see section 1.5 for what changed).</w:t>
       </w:r>
     </w:p>
     <w:sectPr>
@@ -20019,6 +20594,12 @@
     </w:lvlOverride>
   </w:num>
   <w:num w:numId="51" w16cid:durableId="1793089961">
+    <w:abstractNumId w:val="1"/>
+    <w:lvlOverride w:ilvl="0">
+      <w:startOverride w:val="1"/>
+    </w:lvlOverride>
+  </w:num>
+  <w:num w:numId="52">
     <w:abstractNumId w:val="1"/>
     <w:lvlOverride w:ilvl="0">
       <w:startOverride w:val="1"/>

</xml_diff>